<commit_message>
Update submission PDF and DOCX styling to match Google Docs layout
</commit_message>
<xml_diff>
--- a/SakshamGupta_230911186_FGAI_Assignment2.docx
+++ b/SakshamGupta_230911186_FGAI_Assignment2.docx
@@ -8,6 +8,7 @@
       </w:pPr>
       <w:r>
         <w:rPr>
+          <w:rFonts w:ascii="Times New Roman" w:hAnsi="Times New Roman"/>
           <w:b/>
           <w:color w:val="000000"/>
           <w:sz w:val="36"/>
@@ -21,6 +22,7 @@
       </w:pPr>
       <w:r>
         <w:rPr>
+          <w:rFonts w:ascii="Times New Roman" w:hAnsi="Times New Roman"/>
           <w:sz w:val="26"/>
         </w:rPr>
         <w:t>Assignment 2 – Submission Details</w:t>
@@ -28,11 +30,12 @@
     </w:p>
     <w:p>
       <w:pPr>
-        <w:spacing w:after="400"/>
+        <w:spacing w:after="320"/>
       </w:pPr>
     </w:p>
     <w:tbl>
       <w:tblPr>
+        <w:tblStyle w:val="TableGrid"/>
         <w:tblW w:type="auto" w:w="0"/>
         <w:jc w:val="center"/>
         <w:tblLayout w:type="fixed"/>
@@ -246,7 +249,7 @@
             <w:hyperlink r:id="rId9">
               <w:r>
                 <w:rPr>
-                  <w:color w:val="0066CC"/>
+                  <w:color w:val="1155CC"/>
                   <w:u w:val="single"/>
                 </w:rPr>
                 <w:t>https://www.gutenberg.org/files/35/35-0.txt</w:t>
@@ -284,7 +287,7 @@
             <w:hyperlink r:id="rId10">
               <w:r>
                 <w:rPr>
-                  <w:color w:val="0066CC"/>
+                  <w:color w:val="1155CC"/>
                   <w:u w:val="single"/>
                 </w:rPr>
                 <w:t>https://github.com/Saksham-Gupta-GH/fgai-autoregressive-text-generation-timemachine</w:t>
@@ -296,7 +299,7 @@
     </w:tbl>
     <w:sectPr>
       <w:pgSz w:w="12240" w:h="15840"/>
-      <w:pgMar w:top="1728" w:right="1440" w:bottom="1728" w:left="1440" w:header="720" w:footer="720" w:gutter="0"/>
+      <w:pgMar w:top="1440" w:right="1440" w:bottom="1440" w:left="1440" w:header="720" w:footer="720" w:gutter="0"/>
       <w:cols w:space="720"/>
       <w:docGrid w:linePitch="360"/>
     </w:sectPr>
@@ -667,6 +670,10 @@
     <w:name w:val="Normal"/>
     <w:qFormat/>
     <w:rsid w:val="00FC693F"/>
+    <w:rPr>
+      <w:rFonts w:ascii="Times New Roman" w:hAnsi="Times New Roman"/>
+      <w:sz w:val="21"/>
+    </w:rPr>
   </w:style>
   <w:style w:type="paragraph" w:styleId="Header">
     <w:name w:val="header"/>

</xml_diff>

<commit_message>
Replace em-dashes and en-dashes with standard hyphens across submission documents and README
</commit_message>
<xml_diff>
--- a/SakshamGupta_230911186_FGAI_Assignment2.docx
+++ b/SakshamGupta_230911186_FGAI_Assignment2.docx
@@ -25,7 +25,7 @@
           <w:rFonts w:ascii="Times New Roman" w:hAnsi="Times New Roman"/>
           <w:sz w:val="26"/>
         </w:rPr>
-        <w:t>Assignment 2 – Submission Details</w:t>
+        <w:t>Assignment 2 - Submission Details</w:t>
       </w:r>
     </w:p>
     <w:p>
@@ -145,7 +145,7 @@
               <w:rPr>
                 <w:sz w:val="21"/>
               </w:rPr>
-              <w:t>Foundations of Generative AI (ICT4403) – Assignment 2</w:t>
+              <w:t>Foundations of Generative AI (ICT4403) - Assignment 2</w:t>
             </w:r>
           </w:p>
         </w:tc>

</xml_diff>

<commit_message>
Add MIT Manipal institutional logo to submission PDF and Word documents
</commit_message>
<xml_diff>
--- a/SakshamGupta_230911186_FGAI_Assignment2.docx
+++ b/SakshamGupta_230911186_FGAI_Assignment2.docx
@@ -2,6 +2,46 @@
 <file path=word/document.xml><?xml version="1.0" encoding="utf-8"?>
 <w:document xmlns:wpc="http://schemas.microsoft.com/office/word/2010/wordprocessingCanvas" xmlns:mo="http://schemas.microsoft.com/office/mac/office/2008/main" xmlns:mc="http://schemas.openxmlformats.org/markup-compatibility/2006" xmlns:mv="urn:schemas-microsoft-com:mac:vml" xmlns:o="urn:schemas-microsoft-com:office:office" xmlns:r="http://schemas.openxmlformats.org/officeDocument/2006/relationships" xmlns:m="http://schemas.openxmlformats.org/officeDocument/2006/math" xmlns:v="urn:schemas-microsoft-com:vml" xmlns:wp14="http://schemas.microsoft.com/office/word/2010/wordprocessingDrawing" xmlns:wp="http://schemas.openxmlformats.org/drawingml/2006/wordprocessingDrawing" xmlns:w10="urn:schemas-microsoft-com:office:word" xmlns:w="http://schemas.openxmlformats.org/wordprocessingml/2006/main" xmlns:w14="http://schemas.microsoft.com/office/word/2010/wordml" xmlns:wpg="http://schemas.microsoft.com/office/word/2010/wordprocessingGroup" xmlns:wpi="http://schemas.microsoft.com/office/word/2010/wordprocessingInk" xmlns:wne="http://schemas.microsoft.com/office/word/2006/wordml" xmlns:wps="http://schemas.microsoft.com/office/word/2010/wordprocessingShape" mc:Ignorable="w14 wp14">
   <w:body>
+    <w:p>
+      <w:pPr>
+        <w:spacing w:after="320"/>
+        <w:jc w:val="center"/>
+      </w:pPr>
+      <w:r>
+        <w:drawing>
+          <wp:inline xmlns:a="http://schemas.openxmlformats.org/drawingml/2006/main" xmlns:pic="http://schemas.openxmlformats.org/drawingml/2006/picture">
+            <wp:extent cx="4389120" cy="751840"/>
+            <wp:docPr id="1" name="Picture 1"/>
+            <wp:cNvGraphicFramePr>
+              <a:graphicFrameLocks noChangeAspect="1"/>
+            </wp:cNvGraphicFramePr>
+            <a:graphic>
+              <a:graphicData uri="http://schemas.openxmlformats.org/drawingml/2006/picture">
+                <pic:pic>
+                  <pic:nvPicPr>
+                    <pic:cNvPr id="0" name="images.jpeg"/>
+                    <pic:cNvPicPr/>
+                  </pic:nvPicPr>
+                  <pic:blipFill>
+                    <a:blip r:embed="rId9"/>
+                    <a:stretch>
+                      <a:fillRect/>
+                    </a:stretch>
+                  </pic:blipFill>
+                  <pic:spPr>
+                    <a:xfrm>
+                      <a:off x="0" y="0"/>
+                      <a:ext cx="4389120" cy="751840"/>
+                    </a:xfrm>
+                    <a:prstGeom prst="rect"/>
+                  </pic:spPr>
+                </pic:pic>
+              </a:graphicData>
+            </a:graphic>
+          </wp:inline>
+        </w:drawing>
+      </w:r>
+    </w:p>
     <w:p>
       <w:pPr>
         <w:jc w:val="center"/>
@@ -246,7 +286,7 @@
             <w:pPr>
               <w:spacing w:before="100" w:after="100"/>
             </w:pPr>
-            <w:hyperlink r:id="rId9">
+            <w:hyperlink r:id="rId10">
               <w:r>
                 <w:rPr>
                   <w:color w:val="1155CC"/>
@@ -284,7 +324,7 @@
             <w:pPr>
               <w:spacing w:before="100" w:after="100"/>
             </w:pPr>
-            <w:hyperlink r:id="rId10">
+            <w:hyperlink r:id="rId11">
               <w:r>
                 <w:rPr>
                   <w:color w:val="1155CC"/>

</xml_diff>

<commit_message>
Refine submission page layout with balanced vertical proportions, spacious cell padding, and elegant typography matching institutional template
</commit_message>
<xml_diff>
--- a/SakshamGupta_230911186_FGAI_Assignment2.docx
+++ b/SakshamGupta_230911186_FGAI_Assignment2.docx
@@ -4,13 +4,13 @@
   <w:body>
     <w:p>
       <w:pPr>
-        <w:spacing w:after="320"/>
+        <w:spacing w:after="480"/>
         <w:jc w:val="center"/>
       </w:pPr>
       <w:r>
         <w:drawing>
           <wp:inline xmlns:a="http://schemas.openxmlformats.org/drawingml/2006/main" xmlns:pic="http://schemas.openxmlformats.org/drawingml/2006/picture">
-            <wp:extent cx="4389120" cy="751840"/>
+            <wp:extent cx="5120640" cy="877147"/>
             <wp:docPr id="1" name="Picture 1"/>
             <wp:cNvGraphicFramePr>
               <a:graphicFrameLocks noChangeAspect="1"/>
@@ -31,7 +31,7 @@
                   <pic:spPr>
                     <a:xfrm>
                       <a:off x="0" y="0"/>
-                      <a:ext cx="4389120" cy="751840"/>
+                      <a:ext cx="5120640" cy="877147"/>
                     </a:xfrm>
                     <a:prstGeom prst="rect"/>
                   </pic:spPr>
@@ -44,6 +44,7 @@
     </w:p>
     <w:p>
       <w:pPr>
+        <w:spacing w:after="200"/>
         <w:jc w:val="center"/>
       </w:pPr>
       <w:r>
@@ -51,27 +52,25 @@
           <w:rFonts w:ascii="Times New Roman" w:hAnsi="Times New Roman"/>
           <w:b/>
           <w:color w:val="000000"/>
-          <w:sz w:val="36"/>
+          <w:sz w:val="38"/>
         </w:rPr>
         <w:t>Foundations of Generative AI (ICT4403)</w:t>
       </w:r>
     </w:p>
     <w:p>
       <w:pPr>
+        <w:spacing w:after="600"/>
         <w:jc w:val="center"/>
       </w:pPr>
       <w:r>
         <w:rPr>
           <w:rFonts w:ascii="Times New Roman" w:hAnsi="Times New Roman"/>
-          <w:sz w:val="26"/>
+          <w:b/>
+          <w:color w:val="000000"/>
+          <w:sz w:val="28"/>
         </w:rPr>
-        <w:t>Assignment 2 - Submission Details</w:t>
+        <w:t>Assignment 2</w:t>
       </w:r>
-    </w:p>
-    <w:p>
-      <w:pPr>
-        <w:spacing w:after="320"/>
-      </w:pPr>
     </w:p>
     <w:tbl>
       <w:tblPr>
@@ -88,32 +87,32 @@
       <w:tr>
         <w:tc>
           <w:tcPr>
-            <w:tcW w:type="dxa" w:w="3744"/>
+            <w:tcW w:type="dxa" w:w="3168"/>
           </w:tcPr>
           <w:p>
             <w:pPr>
-              <w:spacing w:before="100" w:after="100"/>
+              <w:spacing w:before="220" w:after="220" w:line="276" w:lineRule="auto"/>
             </w:pPr>
             <w:r>
               <w:rPr>
                 <w:b/>
-                <w:sz w:val="21"/>
+                <w:sz w:val="22"/>
               </w:rPr>
-              <w:t>Student name</w:t>
+              <w:t>Student Name</w:t>
             </w:r>
           </w:p>
         </w:tc>
         <w:tc>
           <w:tcPr>
-            <w:tcW w:type="dxa" w:w="6048"/>
+            <w:tcW w:type="dxa" w:w="6192"/>
           </w:tcPr>
           <w:p>
             <w:pPr>
-              <w:spacing w:before="100" w:after="100"/>
+              <w:spacing w:before="220" w:after="220" w:line="276" w:lineRule="auto"/>
             </w:pPr>
             <w:r>
               <w:rPr>
-                <w:sz w:val="21"/>
+                <w:sz w:val="22"/>
               </w:rPr>
               <w:t>Saksham Gupta</w:t>
             </w:r>
@@ -123,32 +122,32 @@
       <w:tr>
         <w:tc>
           <w:tcPr>
-            <w:tcW w:type="dxa" w:w="3744"/>
+            <w:tcW w:type="dxa" w:w="3168"/>
           </w:tcPr>
           <w:p>
             <w:pPr>
-              <w:spacing w:before="100" w:after="100"/>
+              <w:spacing w:before="220" w:after="220" w:line="276" w:lineRule="auto"/>
             </w:pPr>
             <w:r>
               <w:rPr>
                 <w:b/>
-                <w:sz w:val="21"/>
+                <w:sz w:val="22"/>
               </w:rPr>
-              <w:t>Registration number</w:t>
+              <w:t>Registration Number</w:t>
             </w:r>
           </w:p>
         </w:tc>
         <w:tc>
           <w:tcPr>
-            <w:tcW w:type="dxa" w:w="6048"/>
+            <w:tcW w:type="dxa" w:w="6192"/>
           </w:tcPr>
           <w:p>
             <w:pPr>
-              <w:spacing w:before="100" w:after="100"/>
+              <w:spacing w:before="220" w:after="220" w:line="276" w:lineRule="auto"/>
             </w:pPr>
             <w:r>
               <w:rPr>
-                <w:sz w:val="21"/>
+                <w:sz w:val="22"/>
               </w:rPr>
               <w:t>230911186</w:t>
             </w:r>
@@ -158,34 +157,34 @@
       <w:tr>
         <w:tc>
           <w:tcPr>
-            <w:tcW w:type="dxa" w:w="3744"/>
+            <w:tcW w:type="dxa" w:w="3168"/>
           </w:tcPr>
           <w:p>
             <w:pPr>
-              <w:spacing w:before="100" w:after="100"/>
+              <w:spacing w:before="220" w:after="220" w:line="276" w:lineRule="auto"/>
             </w:pPr>
             <w:r>
               <w:rPr>
                 <w:b/>
-                <w:sz w:val="21"/>
+                <w:sz w:val="22"/>
               </w:rPr>
-              <w:t>Assignment title</w:t>
+              <w:t>Assignment Title</w:t>
             </w:r>
           </w:p>
         </w:tc>
         <w:tc>
           <w:tcPr>
-            <w:tcW w:type="dxa" w:w="6048"/>
+            <w:tcW w:type="dxa" w:w="6192"/>
           </w:tcPr>
           <w:p>
             <w:pPr>
-              <w:spacing w:before="100" w:after="100"/>
+              <w:spacing w:before="220" w:after="220" w:line="276" w:lineRule="auto"/>
             </w:pPr>
             <w:r>
               <w:rPr>
-                <w:sz w:val="21"/>
+                <w:sz w:val="22"/>
               </w:rPr>
-              <w:t>Foundations of Generative AI (ICT4403) - Assignment 2</w:t>
+              <w:t>Assignment 2 – Autoregressive Text Generation using Simple RNN, Bidirectional RNN, LSTM and GRU</w:t>
             </w:r>
           </w:p>
         </w:tc>
@@ -193,32 +192,32 @@
       <w:tr>
         <w:tc>
           <w:tcPr>
-            <w:tcW w:type="dxa" w:w="3744"/>
+            <w:tcW w:type="dxa" w:w="3168"/>
           </w:tcPr>
           <w:p>
             <w:pPr>
-              <w:spacing w:before="100" w:after="100"/>
+              <w:spacing w:before="220" w:after="220" w:line="276" w:lineRule="auto"/>
             </w:pPr>
             <w:r>
               <w:rPr>
                 <w:b/>
-                <w:sz w:val="21"/>
+                <w:sz w:val="22"/>
               </w:rPr>
-              <w:t>Title of the developed autoregressive text-generation system</w:t>
+              <w:t>Title of the Developed System</w:t>
             </w:r>
           </w:p>
         </w:tc>
         <w:tc>
           <w:tcPr>
-            <w:tcW w:type="dxa" w:w="6048"/>
+            <w:tcW w:type="dxa" w:w="6192"/>
           </w:tcPr>
           <w:p>
             <w:pPr>
-              <w:spacing w:before="100" w:after="100"/>
+              <w:spacing w:before="220" w:after="220" w:line="276" w:lineRule="auto"/>
             </w:pPr>
             <w:r>
               <w:rPr>
-                <w:sz w:val="21"/>
+                <w:sz w:val="22"/>
               </w:rPr>
               <w:t>Comparative Word-Level Autoregressive Text Generation on H. G. Wells' The Time Machine using Simple RNN, Bidirectional RNN, LSTM, and GRU</w:t>
             </w:r>
@@ -228,32 +227,32 @@
       <w:tr>
         <w:tc>
           <w:tcPr>
-            <w:tcW w:type="dxa" w:w="3744"/>
+            <w:tcW w:type="dxa" w:w="3168"/>
           </w:tcPr>
           <w:p>
             <w:pPr>
-              <w:spacing w:before="100" w:after="100"/>
+              <w:spacing w:before="220" w:after="220" w:line="276" w:lineRule="auto"/>
             </w:pPr>
             <w:r>
               <w:rPr>
                 <w:b/>
-                <w:sz w:val="21"/>
+                <w:sz w:val="22"/>
               </w:rPr>
-              <w:t>Dataset name</w:t>
+              <w:t>Dataset Name</w:t>
             </w:r>
           </w:p>
         </w:tc>
         <w:tc>
           <w:tcPr>
-            <w:tcW w:type="dxa" w:w="6048"/>
+            <w:tcW w:type="dxa" w:w="6192"/>
           </w:tcPr>
           <w:p>
             <w:pPr>
-              <w:spacing w:before="100" w:after="100"/>
+              <w:spacing w:before="220" w:after="220" w:line="276" w:lineRule="auto"/>
             </w:pPr>
             <w:r>
               <w:rPr>
-                <w:sz w:val="21"/>
+                <w:sz w:val="22"/>
               </w:rPr>
               <w:t>The Time Machine by H. G. Wells (Project Gutenberg eBook #35)</w:t>
             </w:r>
@@ -263,28 +262,28 @@
       <w:tr>
         <w:tc>
           <w:tcPr>
-            <w:tcW w:type="dxa" w:w="3744"/>
+            <w:tcW w:type="dxa" w:w="3168"/>
           </w:tcPr>
           <w:p>
             <w:pPr>
-              <w:spacing w:before="100" w:after="100"/>
+              <w:spacing w:before="220" w:after="220" w:line="276" w:lineRule="auto"/>
             </w:pPr>
             <w:r>
               <w:rPr>
                 <w:b/>
-                <w:sz w:val="21"/>
+                <w:sz w:val="22"/>
               </w:rPr>
-              <w:t>Dataset link</w:t>
+              <w:t>Dataset Link</w:t>
             </w:r>
           </w:p>
         </w:tc>
         <w:tc>
           <w:tcPr>
-            <w:tcW w:type="dxa" w:w="6048"/>
+            <w:tcW w:type="dxa" w:w="6192"/>
           </w:tcPr>
           <w:p>
             <w:pPr>
-              <w:spacing w:before="100" w:after="100"/>
+              <w:spacing w:before="220" w:after="220" w:line="276" w:lineRule="auto"/>
             </w:pPr>
             <w:hyperlink r:id="rId10">
               <w:r>
@@ -301,28 +300,28 @@
       <w:tr>
         <w:tc>
           <w:tcPr>
-            <w:tcW w:type="dxa" w:w="3744"/>
+            <w:tcW w:type="dxa" w:w="3168"/>
           </w:tcPr>
           <w:p>
             <w:pPr>
-              <w:spacing w:before="100" w:after="100"/>
+              <w:spacing w:before="220" w:after="220" w:line="276" w:lineRule="auto"/>
             </w:pPr>
             <w:r>
               <w:rPr>
                 <w:b/>
-                <w:sz w:val="21"/>
+                <w:sz w:val="22"/>
               </w:rPr>
-              <w:t>GitHub repository link</w:t>
+              <w:t>GitHub Repository Link</w:t>
             </w:r>
           </w:p>
         </w:tc>
         <w:tc>
           <w:tcPr>
-            <w:tcW w:type="dxa" w:w="6048"/>
+            <w:tcW w:type="dxa" w:w="6192"/>
           </w:tcPr>
           <w:p>
             <w:pPr>
-              <w:spacing w:before="100" w:after="100"/>
+              <w:spacing w:before="220" w:after="220" w:line="276" w:lineRule="auto"/>
             </w:pPr>
             <w:hyperlink r:id="rId11">
               <w:r>
@@ -339,7 +338,7 @@
     </w:tbl>
     <w:sectPr>
       <w:pgSz w:w="12240" w:h="15840"/>
-      <w:pgMar w:top="1440" w:right="1440" w:bottom="1440" w:left="1440" w:header="720" w:footer="720" w:gutter="0"/>
+      <w:pgMar w:top="1584" w:right="1440" w:bottom="1584" w:left="1440" w:header="720" w:footer="720" w:gutter="0"/>
       <w:cols w:space="720"/>
       <w:docGrid w:linePitch="360"/>
     </w:sectPr>
@@ -712,7 +711,7 @@
     <w:rsid w:val="00FC693F"/>
     <w:rPr>
       <w:rFonts w:ascii="Times New Roman" w:hAnsi="Times New Roman"/>
-      <w:sz w:val="21"/>
+      <w:sz w:val="22"/>
     </w:rPr>
   </w:style>
   <w:style w:type="paragraph" w:styleId="Header">

</xml_diff>